<commit_message>
add pdf template for activity
</commit_message>
<xml_diff>
--- a/docs/3-activities/instructions/02.1-activity-intro-to-crd.docx
+++ b/docs/3-activities/instructions/02.1-activity-intro-to-crd.docx
@@ -145,6 +145,24 @@
         </w:tc>
       </w:tr>
     </w:tbl>
+    <w:p>
+      <w:pPr>
+        <w:pStyle w:val="BodyText"/>
+      </w:pPr>
+      <w:r>
+        <w:rPr>
+          <w:i/>
+          <w:iCs/>
+        </w:rPr>
+        <w:t xml:space="preserve">I worked on this activity with:</w:t>
+      </w:r>
+      <w:r>
+        <w:t xml:space="preserve"> </w:t>
+      </w:r>
+      <w:r>
+        <w:t xml:space="preserve">______________________________</w:t>
+      </w:r>
+    </w:p>
     <w:p>
       <w:pPr>
         <w:pStyle w:val="BodyText"/>

</xml_diff>

<commit_message>
update activities and solutions
</commit_message>
<xml_diff>
--- a/docs/3-activities/instructions/02.1-activity-intro-to-crd.docx
+++ b/docs/3-activities/instructions/02.1-activity-intro-to-crd.docx
@@ -186,7 +186,7 @@
           <w:rPr>
             <w:rStyle w:val="Hyperlink"/>
           </w:rPr>
-          <w:t xml:space="preserve">2.1-activity-intro-to-crd.qmd</w:t>
+          <w:t xml:space="preserve">01.1-activity-turkey-in-pens.qmd</w:t>
         </w:r>
       </w:hyperlink>
     </w:p>
@@ -2016,6 +2016,219 @@
       </w:r>
       <w:r>
         <w:t xml:space="preserve">(Fully actuated).</w:t>
+      </w:r>
+    </w:p>
+    <w:p>
+      <w:pPr>
+        <w:pStyle w:val="BodyText"/>
+      </w:pPr>
+      <m:oMathPara>
+        <m:oMathParaPr>
+          <m:jc m:val="center"/>
+        </m:oMathParaPr>
+        <m:oMath>
+          <m:eqArr>
+            <m:e>
+              <m:sSub>
+                <m:e>
+                  <m:acc>
+                    <m:accPr>
+                      <m:chr m:val="̂"/>
+                    </m:accPr>
+                    <m:e>
+                      <m:r>
+                        <m:t>τ</m:t>
+                      </m:r>
+                    </m:e>
+                  </m:acc>
+                </m:e>
+                <m:sub>
+                  <m:r>
+                    <m:t>3</m:t>
+                  </m:r>
+                </m:sub>
+              </m:sSub>
+              <m:r>
+                <m:t>&amp;</m:t>
+              </m:r>
+              <m:r>
+                <m:rPr>
+                  <m:sty m:val="p"/>
+                </m:rPr>
+                <m:t>=</m:t>
+              </m:r>
+              <m:r>
+                <m:rPr>
+                  <m:sty m:val="p"/>
+                </m:rPr>
+                <m:t>−</m:t>
+              </m:r>
+              <m:r>
+                <m:rPr>
+                  <m:sty m:val="p"/>
+                </m:rPr>
+                <m:t>(</m:t>
+              </m:r>
+              <m:sSub>
+                <m:e>
+                  <m:acc>
+                    <m:accPr>
+                      <m:chr m:val="̂"/>
+                    </m:accPr>
+                    <m:e>
+                      <m:r>
+                        <m:t>τ</m:t>
+                      </m:r>
+                    </m:e>
+                  </m:acc>
+                </m:e>
+                <m:sub>
+                  <m:r>
+                    <m:t>1</m:t>
+                  </m:r>
+                </m:sub>
+              </m:sSub>
+              <m:r>
+                <m:rPr>
+                  <m:sty m:val="p"/>
+                </m:rPr>
+                <m:t>+</m:t>
+              </m:r>
+              <m:sSub>
+                <m:e>
+                  <m:acc>
+                    <m:accPr>
+                      <m:chr m:val="̂"/>
+                    </m:accPr>
+                    <m:e>
+                      <m:r>
+                        <m:t>τ</m:t>
+                      </m:r>
+                    </m:e>
+                  </m:acc>
+                </m:e>
+                <m:sub>
+                  <m:r>
+                    <m:t>2</m:t>
+                  </m:r>
+                </m:sub>
+              </m:sSub>
+              <m:r>
+                <m:rPr>
+                  <m:sty m:val="p"/>
+                </m:rPr>
+                <m:t>)</m:t>
+              </m:r>
+            </m:e>
+            <m:e>
+              <m:r>
+                <m:t>&amp;</m:t>
+              </m:r>
+              <m:r>
+                <m:rPr>
+                  <m:sty m:val="p"/>
+                </m:rPr>
+                <m:t>=</m:t>
+              </m:r>
+              <m:r>
+                <m:rPr>
+                  <m:sty m:val="p"/>
+                </m:rPr>
+                <m:t>−</m:t>
+              </m:r>
+              <m:r>
+                <m:rPr>
+                  <m:sty m:val="p"/>
+                </m:rPr>
+                <m:t>(</m:t>
+              </m:r>
+              <m:r>
+                <m:t>12.020</m:t>
+              </m:r>
+              <m:r>
+                <m:rPr>
+                  <m:sty m:val="p"/>
+                </m:rPr>
+                <m:t>−</m:t>
+              </m:r>
+              <m:r>
+                <m:t>2.56</m:t>
+              </m:r>
+              <m:r>
+                <m:rPr>
+                  <m:sty m:val="p"/>
+                </m:rPr>
+                <m:t>)</m:t>
+              </m:r>
+            </m:e>
+            <m:e>
+              <m:r>
+                <m:t>&amp;</m:t>
+              </m:r>
+              <m:r>
+                <m:rPr>
+                  <m:sty m:val="p"/>
+                </m:rPr>
+                <m:t>=</m:t>
+              </m:r>
+              <m:r>
+                <m:rPr>
+                  <m:sty m:val="p"/>
+                </m:rPr>
+                <m:t>−</m:t>
+              </m:r>
+              <m:r>
+                <m:t>9.452</m:t>
+              </m:r>
+            </m:e>
+          </m:eqArr>
+        </m:oMath>
+      </m:oMathPara>
+    </w:p>
+    <w:p>
+      <w:pPr>
+        <w:pStyle w:val="FirstParagraph"/>
+      </w:pPr>
+      <m:oMath>
+        <m:acc>
+          <m:accPr>
+            <m:chr m:val="̂"/>
+          </m:accPr>
+          <m:e>
+            <m:r>
+              <m:t>μ</m:t>
+            </m:r>
+          </m:e>
+        </m:acc>
+        <m:r>
+          <m:rPr>
+            <m:sty m:val="p"/>
+          </m:rPr>
+          <m:t>=</m:t>
+        </m:r>
+        <m:r>
+          <m:t>23.46</m:t>
+        </m:r>
+      </m:oMath>
+    </w:p>
+    <w:p>
+      <w:pPr>
+        <w:pStyle w:val="SourceCode"/>
+      </w:pPr>
+      <w:r>
+        <w:rPr>
+          <w:rStyle w:val="VerbatimChar"/>
+        </w:rPr>
+        <w:t xml:space="preserve">Error:</w:t>
+      </w:r>
+      <w:r>
+        <w:br/>
+      </w:r>
+      <w:r>
+        <w:rPr>
+          <w:rStyle w:val="VerbatimChar"/>
+        </w:rPr>
+        <w:t xml:space="preserve">! object 'traffic_mod' not found</w:t>
       </w:r>
     </w:p>
     <w:bookmarkEnd w:id="21"/>

</xml_diff>